<commit_message>
Added submission project proposal
</commit_message>
<xml_diff>
--- a/docs/DATS 6102_ Group 1 - Project Proposal.docx
+++ b/docs/DATS 6102_ Group 1 - Project Proposal.docx
@@ -5,25 +5,57 @@
     <w:p>
       <w:pPr>
         <w:pStyle w:val="Heading3"/>
-        <w:spacing w:after="200" w:before="200" w:line="360" w:lineRule="auto"/>
+        <w:spacing w:after="200" w:before="200" w:line="240" w:lineRule="auto"/>
         <w:ind w:left="0" w:right="0" w:firstLine="0"/>
+        <w:jc w:val="center"/>
         <w:rPr>
           <w:b w:val="1"/>
           <w:bCs w:val="1"/>
           <w:color w:val="000000"/>
-          <w:sz w:val="26"/>
-          <w:szCs w:val="26"/>
-        </w:rPr>
-      </w:pPr>
-      <w:bookmarkStart w:colFirst="0" w:colLast="0" w:name="_bjx2newz1eko" w:id="0"/>
+        </w:rPr>
+      </w:pPr>
+      <w:bookmarkStart w:colFirst="0" w:colLast="0" w:name="_vulckv3alaug" w:id="0"/>
       <w:bookmarkEnd w:id="0"/>
       <w:r>
         <w:rPr>
           <w:b w:val="1"/>
           <w:bCs w:val="1"/>
-          <w:color w:val="000000"/>
-          <w:sz w:val="26"/>
-          <w:szCs w:val="26"/>
+          <w:color w:val="856412"/>
+          <w:sz w:val="30"/>
+          <w:szCs w:val="30"/>
+          <w:rtl w:val="0"/>
+        </w:rPr>
+        <w:t xml:space="preserve">ShopTrack</w:t>
+      </w:r>
+      <w:r>
+        <w:rPr>
+          <w:rtl w:val="0"/>
+        </w:rPr>
+      </w:r>
+    </w:p>
+    <w:p>
+      <w:pPr>
+        <w:pStyle w:val="Heading3"/>
+        <w:spacing w:after="200" w:before="200" w:line="240" w:lineRule="auto"/>
+        <w:ind w:left="0" w:right="0" w:firstLine="0"/>
+        <w:jc w:val="center"/>
+        <w:rPr>
+          <w:b w:val="1"/>
+          <w:bCs w:val="1"/>
+          <w:color w:val="188038"/>
+          <w:sz w:val="24"/>
+          <w:szCs w:val="24"/>
+        </w:rPr>
+      </w:pPr>
+      <w:bookmarkStart w:colFirst="0" w:colLast="0" w:name="_bjx2newz1eko" w:id="1"/>
+      <w:bookmarkEnd w:id="1"/>
+      <w:r>
+        <w:rPr>
+          <w:b w:val="1"/>
+          <w:bCs w:val="1"/>
+          <w:color w:val="188038"/>
+          <w:sz w:val="24"/>
+          <w:szCs w:val="24"/>
           <w:rtl w:val="0"/>
         </w:rPr>
         <w:t xml:space="preserve">Group </w:t>
@@ -32,9 +64,9 @@
         <w:rPr>
           <w:b w:val="1"/>
           <w:bCs w:val="1"/>
-          <w:color w:val="000000"/>
-          <w:sz w:val="26"/>
-          <w:szCs w:val="26"/>
+          <w:color w:val="188038"/>
+          <w:sz w:val="24"/>
+          <w:szCs w:val="24"/>
           <w:rtl w:val="0"/>
         </w:rPr>
         <w:t xml:space="preserve">1 - Project Proposal</w:t>
@@ -46,17 +78,21 @@
           <w:ilvl w:val="0"/>
           <w:numId w:val="3"/>
         </w:numPr>
-        <w:spacing w:after="200" w:before="200" w:line="360" w:lineRule="auto"/>
+        <w:spacing w:after="200" w:before="200" w:line="276" w:lineRule="auto"/>
         <w:ind w:left="720" w:hanging="360"/>
         <w:rPr>
           <w:b w:val="1"/>
           <w:bCs w:val="1"/>
-        </w:rPr>
-      </w:pPr>
-      <w:r>
-        <w:rPr>
-          <w:b w:val="1"/>
-          <w:bCs w:val="1"/>
+          <w:sz w:val="20"/>
+          <w:szCs w:val="20"/>
+        </w:rPr>
+      </w:pPr>
+      <w:r>
+        <w:rPr>
+          <w:b w:val="1"/>
+          <w:bCs w:val="1"/>
+          <w:sz w:val="20"/>
+          <w:szCs w:val="20"/>
           <w:rtl w:val="0"/>
         </w:rPr>
         <w:t xml:space="preserve">Group number and names of all group members.</w:t>
@@ -64,12 +100,17 @@
     </w:p>
     <w:p>
       <w:pPr>
-        <w:spacing w:after="200" w:before="200" w:line="360" w:lineRule="auto"/>
+        <w:spacing w:after="200" w:before="200" w:line="276" w:lineRule="auto"/>
         <w:ind w:left="720" w:firstLine="0"/>
-        <w:rPr/>
-      </w:pPr>
-      <w:r>
-        <w:rPr>
+        <w:rPr>
+          <w:sz w:val="20"/>
+          <w:szCs w:val="20"/>
+        </w:rPr>
+      </w:pPr>
+      <w:r>
+        <w:rPr>
+          <w:sz w:val="20"/>
+          <w:szCs w:val="20"/>
           <w:rtl w:val="0"/>
         </w:rPr>
         <w:t xml:space="preserve">Group 1: Damian Mendoza, Ingri Quevedo, Stephanie Armstrong, Hassan Saleh H Alshamrani</w:t>
@@ -81,17 +122,21 @@
           <w:ilvl w:val="0"/>
           <w:numId w:val="3"/>
         </w:numPr>
-        <w:spacing w:after="200" w:before="200" w:line="360" w:lineRule="auto"/>
+        <w:spacing w:after="200" w:before="200" w:line="276" w:lineRule="auto"/>
         <w:ind w:left="720" w:hanging="360"/>
         <w:rPr>
           <w:b w:val="1"/>
           <w:bCs w:val="1"/>
-        </w:rPr>
-      </w:pPr>
-      <w:r>
-        <w:rPr>
-          <w:b w:val="1"/>
-          <w:bCs w:val="1"/>
+          <w:sz w:val="20"/>
+          <w:szCs w:val="20"/>
+        </w:rPr>
+      </w:pPr>
+      <w:r>
+        <w:rPr>
+          <w:b w:val="1"/>
+          <w:bCs w:val="1"/>
+          <w:sz w:val="20"/>
+          <w:szCs w:val="20"/>
           <w:rtl w:val="0"/>
         </w:rPr>
         <w:t xml:space="preserve">Assigned NoSQL database and its primary database model.</w:t>
@@ -99,12 +144,17 @@
     </w:p>
     <w:p>
       <w:pPr>
-        <w:spacing w:after="200" w:before="200" w:line="360" w:lineRule="auto"/>
+        <w:spacing w:after="200" w:before="200" w:line="276" w:lineRule="auto"/>
         <w:ind w:left="720" w:firstLine="0"/>
-        <w:rPr/>
-      </w:pPr>
-      <w:r>
-        <w:rPr>
+        <w:rPr>
+          <w:sz w:val="20"/>
+          <w:szCs w:val="20"/>
+        </w:rPr>
+      </w:pPr>
+      <w:r>
+        <w:rPr>
+          <w:sz w:val="20"/>
+          <w:szCs w:val="20"/>
           <w:rtl w:val="0"/>
         </w:rPr>
         <w:t xml:space="preserve">Apache CouchDB: a document database. Data is stored as JSON documents and accessed over HTTP/REST. </w:t>
@@ -116,17 +166,21 @@
           <w:ilvl w:val="0"/>
           <w:numId w:val="3"/>
         </w:numPr>
-        <w:spacing w:after="200" w:before="200" w:line="360" w:lineRule="auto"/>
+        <w:spacing w:after="200" w:before="200" w:line="276" w:lineRule="auto"/>
         <w:ind w:left="720" w:hanging="360"/>
         <w:rPr>
           <w:b w:val="1"/>
           <w:bCs w:val="1"/>
-        </w:rPr>
-      </w:pPr>
-      <w:r>
-        <w:rPr>
-          <w:b w:val="1"/>
-          <w:bCs w:val="1"/>
+          <w:sz w:val="20"/>
+          <w:szCs w:val="20"/>
+        </w:rPr>
+      </w:pPr>
+      <w:r>
+        <w:rPr>
+          <w:b w:val="1"/>
+          <w:bCs w:val="1"/>
+          <w:sz w:val="20"/>
+          <w:szCs w:val="20"/>
           <w:rtl w:val="0"/>
         </w:rPr>
         <w:t xml:space="preserve">Business problem, intended users, and why the problem is suitable for the assigned NoSQL platform.</w:t>
@@ -134,20 +188,27 @@
     </w:p>
     <w:p>
       <w:pPr>
-        <w:spacing w:after="200" w:before="200" w:line="360" w:lineRule="auto"/>
+        <w:spacing w:after="200" w:before="200" w:line="276" w:lineRule="auto"/>
         <w:ind w:left="720" w:firstLine="0"/>
-        <w:rPr/>
-      </w:pPr>
-      <w:r>
-        <w:rPr>
-          <w:b w:val="1"/>
-          <w:bCs w:val="1"/>
+        <w:rPr>
+          <w:sz w:val="20"/>
+          <w:szCs w:val="20"/>
+        </w:rPr>
+      </w:pPr>
+      <w:r>
+        <w:rPr>
+          <w:b w:val="1"/>
+          <w:bCs w:val="1"/>
+          <w:sz w:val="20"/>
+          <w:szCs w:val="20"/>
           <w:rtl w:val="0"/>
         </w:rPr>
         <w:t xml:space="preserve">Business Problem:</w:t>
       </w:r>
       <w:r>
         <w:rPr>
+          <w:sz w:val="20"/>
+          <w:szCs w:val="20"/>
           <w:rtl w:val="0"/>
         </w:rPr>
         <w:t xml:space="preserve"> ShopTrack is a simple order management system for a small online store. It tracks orders through four stages: processing, shipped, delivered, and cancelled.</w:t>
@@ -155,12 +216,17 @@
     </w:p>
     <w:p>
       <w:pPr>
-        <w:spacing w:after="200" w:before="200" w:line="360" w:lineRule="auto"/>
+        <w:spacing w:after="200" w:before="200" w:line="276" w:lineRule="auto"/>
         <w:ind w:left="720" w:firstLine="0"/>
-        <w:rPr/>
-      </w:pPr>
-      <w:r>
-        <w:rPr>
+        <w:rPr>
+          <w:sz w:val="20"/>
+          <w:szCs w:val="20"/>
+        </w:rPr>
+      </w:pPr>
+      <w:r>
+        <w:rPr>
+          <w:sz w:val="20"/>
+          <w:szCs w:val="20"/>
           <w:rtl w:val="0"/>
         </w:rPr>
         <w:t xml:space="preserve">The </w:t>
@@ -169,12 +235,16 @@
         <w:rPr>
           <w:b w:val="1"/>
           <w:bCs w:val="1"/>
+          <w:sz w:val="20"/>
+          <w:szCs w:val="20"/>
           <w:rtl w:val="0"/>
         </w:rPr>
         <w:t xml:space="preserve">intended users</w:t>
       </w:r>
       <w:r>
         <w:rPr>
+          <w:sz w:val="20"/>
+          <w:szCs w:val="20"/>
           <w:rtl w:val="0"/>
         </w:rPr>
         <w:t xml:space="preserve"> are store managers, who monitor order status across the store, and customer support staff, who need to find a customer’s orders quickly and update them when something changes. </w:t>
@@ -183,12 +253,16 @@
         <w:rPr>
           <w:b w:val="1"/>
           <w:bCs w:val="1"/>
+          <w:sz w:val="20"/>
+          <w:szCs w:val="20"/>
           <w:rtl w:val="0"/>
         </w:rPr>
         <w:t xml:space="preserve">CouchDB fits this scenario because each order is a self-contained</w:t>
       </w:r>
       <w:r>
         <w:rPr>
+          <w:sz w:val="20"/>
+          <w:szCs w:val="20"/>
           <w:rtl w:val="0"/>
         </w:rPr>
         <w:t xml:space="preserve"> record holding the customer, items, prices, address, and dates. CouchDB can store the whole order as a single JSON document and return it in one request by ID. The same data will also be loaded into MySQL so both databases can be compared on identical tasks.</w:t>
@@ -200,17 +274,21 @@
           <w:ilvl w:val="0"/>
           <w:numId w:val="3"/>
         </w:numPr>
-        <w:spacing w:after="200" w:before="200" w:line="360" w:lineRule="auto"/>
+        <w:spacing w:after="200" w:before="200" w:line="276" w:lineRule="auto"/>
         <w:ind w:left="720" w:hanging="360"/>
         <w:rPr>
           <w:b w:val="1"/>
           <w:bCs w:val="1"/>
-        </w:rPr>
-      </w:pPr>
-      <w:r>
-        <w:rPr>
-          <w:b w:val="1"/>
-          <w:bCs w:val="1"/>
+          <w:sz w:val="20"/>
+          <w:szCs w:val="20"/>
+        </w:rPr>
+      </w:pPr>
+      <w:r>
+        <w:rPr>
+          <w:b w:val="1"/>
+          <w:bCs w:val="1"/>
+          <w:sz w:val="20"/>
+          <w:szCs w:val="20"/>
           <w:rtl w:val="0"/>
         </w:rPr>
         <w:t xml:space="preserve">Dataset source, format, approximate size, and planned preparation/cleaning.</w:t>
@@ -218,20 +296,27 @@
     </w:p>
     <w:p>
       <w:pPr>
-        <w:spacing w:after="200" w:before="200" w:line="360" w:lineRule="auto"/>
+        <w:spacing w:after="200" w:before="200" w:line="276" w:lineRule="auto"/>
         <w:ind w:left="720" w:firstLine="0"/>
-        <w:rPr/>
-      </w:pPr>
-      <w:r>
-        <w:rPr>
-          <w:b w:val="1"/>
-          <w:bCs w:val="1"/>
+        <w:rPr>
+          <w:sz w:val="20"/>
+          <w:szCs w:val="20"/>
+        </w:rPr>
+      </w:pPr>
+      <w:r>
+        <w:rPr>
+          <w:b w:val="1"/>
+          <w:bCs w:val="1"/>
+          <w:sz w:val="20"/>
+          <w:szCs w:val="20"/>
           <w:rtl w:val="0"/>
         </w:rPr>
         <w:t xml:space="preserve">The dataset is synthetic (dummy) data.</w:t>
       </w:r>
       <w:r>
         <w:rPr>
+          <w:sz w:val="20"/>
+          <w:szCs w:val="20"/>
           <w:rtl w:val="0"/>
         </w:rPr>
         <w:t xml:space="preserve"> Its structure and product examples are based on a public sample orders dataset (JSONSift), and all orders were generated for practice, so there is no real customer data and no privacy concern. The data comes in two files containing the same orders: a JSON file for CouchDB (orders_500_couchdb.json) and a SQL file for MySQL (orders_500_mysql.sql). It includes 500 orders, 80 customer IDs, 8 products, and 1,520 order items across five cities (Austin, Boston, Chicago, San Francisco, and Seattle), with 125 orders in each status.</w:t>
@@ -239,20 +324,27 @@
     </w:p>
     <w:p>
       <w:pPr>
-        <w:spacing w:after="200" w:before="200" w:line="360" w:lineRule="auto"/>
+        <w:spacing w:after="200" w:before="200" w:line="276" w:lineRule="auto"/>
         <w:ind w:left="720" w:firstLine="0"/>
-        <w:rPr/>
-      </w:pPr>
-      <w:r>
-        <w:rPr>
-          <w:b w:val="1"/>
-          <w:bCs w:val="1"/>
+        <w:rPr>
+          <w:sz w:val="20"/>
+          <w:szCs w:val="20"/>
+        </w:rPr>
+      </w:pPr>
+      <w:r>
+        <w:rPr>
+          <w:b w:val="1"/>
+          <w:bCs w:val="1"/>
+          <w:sz w:val="20"/>
+          <w:szCs w:val="20"/>
           <w:rtl w:val="0"/>
         </w:rPr>
         <w:t xml:space="preserve">Key fields:</w:t>
       </w:r>
       <w:r>
         <w:rPr>
+          <w:sz w:val="20"/>
+          <w:szCs w:val="20"/>
           <w:rtl w:val="0"/>
         </w:rPr>
         <w:t xml:space="preserve"> id/_id, userId, status, items (sku, name, quantity, unitPrice), subtotal, tax, shipping, total, shippingAddress, createdAt, deliveredAt, currency, and dataOrigin.</w:t>
@@ -260,20 +352,27 @@
     </w:p>
     <w:p>
       <w:pPr>
-        <w:spacing w:after="200" w:before="200" w:line="360" w:lineRule="auto"/>
+        <w:spacing w:after="200" w:before="200" w:line="276" w:lineRule="auto"/>
         <w:ind w:left="720" w:firstLine="0"/>
-        <w:rPr/>
-      </w:pPr>
-      <w:r>
-        <w:rPr>
-          <w:b w:val="1"/>
-          <w:bCs w:val="1"/>
+        <w:rPr>
+          <w:sz w:val="20"/>
+          <w:szCs w:val="20"/>
+        </w:rPr>
+      </w:pPr>
+      <w:r>
+        <w:rPr>
+          <w:b w:val="1"/>
+          <w:bCs w:val="1"/>
+          <w:sz w:val="20"/>
+          <w:szCs w:val="20"/>
           <w:rtl w:val="0"/>
         </w:rPr>
         <w:t xml:space="preserve">Preparation:</w:t>
       </w:r>
       <w:r>
         <w:rPr>
+          <w:sz w:val="20"/>
+          <w:szCs w:val="20"/>
           <w:rtl w:val="0"/>
         </w:rPr>
         <w:t xml:space="preserve"> The files are already prepared. After import, the group will verify that both databases contain exactly 500 orders. The files will be imported once to avoid duplicates. The imports have not been tested yet.</w:t>
@@ -285,17 +384,21 @@
           <w:ilvl w:val="0"/>
           <w:numId w:val="3"/>
         </w:numPr>
-        <w:spacing w:after="200" w:before="200" w:line="360" w:lineRule="auto"/>
+        <w:spacing w:after="200" w:before="200" w:line="276" w:lineRule="auto"/>
         <w:ind w:left="720" w:hanging="360"/>
         <w:rPr>
           <w:b w:val="1"/>
           <w:bCs w:val="1"/>
-        </w:rPr>
-      </w:pPr>
-      <w:r>
-        <w:rPr>
-          <w:b w:val="1"/>
-          <w:bCs w:val="1"/>
+          <w:sz w:val="20"/>
+          <w:szCs w:val="20"/>
+        </w:rPr>
+      </w:pPr>
+      <w:r>
+        <w:rPr>
+          <w:b w:val="1"/>
+          <w:bCs w:val="1"/>
+          <w:sz w:val="20"/>
+          <w:szCs w:val="20"/>
           <w:rtl w:val="0"/>
         </w:rPr>
         <w:t xml:space="preserve">Preliminary NoSQL data model or structure.</w:t>
@@ -303,20 +406,27 @@
     </w:p>
     <w:p>
       <w:pPr>
-        <w:spacing w:after="200" w:before="200" w:line="360" w:lineRule="auto"/>
+        <w:spacing w:after="200" w:before="200" w:line="276" w:lineRule="auto"/>
         <w:ind w:left="720" w:firstLine="0"/>
-        <w:rPr/>
-      </w:pPr>
-      <w:r>
-        <w:rPr>
-          <w:b w:val="1"/>
-          <w:bCs w:val="1"/>
+        <w:rPr>
+          <w:sz w:val="20"/>
+          <w:szCs w:val="20"/>
+        </w:rPr>
+      </w:pPr>
+      <w:r>
+        <w:rPr>
+          <w:b w:val="1"/>
+          <w:bCs w:val="1"/>
+          <w:sz w:val="20"/>
+          <w:szCs w:val="20"/>
           <w:rtl w:val="0"/>
         </w:rPr>
         <w:t xml:space="preserve">CouchDB:</w:t>
       </w:r>
       <w:r>
         <w:rPr>
+          <w:sz w:val="20"/>
+          <w:szCs w:val="20"/>
           <w:rtl w:val="0"/>
         </w:rPr>
         <w:t xml:space="preserve"> One database with one document per order. The </w:t>
@@ -325,12 +435,16 @@
         <w:rPr>
           <w:i w:val="1"/>
           <w:iCs w:val="1"/>
+          <w:sz w:val="20"/>
+          <w:szCs w:val="20"/>
           <w:rtl w:val="0"/>
         </w:rPr>
         <w:t xml:space="preserve">_id</w:t>
       </w:r>
       <w:r>
         <w:rPr>
+          <w:sz w:val="20"/>
+          <w:szCs w:val="20"/>
           <w:rtl w:val="0"/>
         </w:rPr>
         <w:t xml:space="preserve"> is the order number (e.g., </w:t>
@@ -339,12 +453,16 @@
         <w:rPr>
           <w:i w:val="1"/>
           <w:iCs w:val="1"/>
+          <w:sz w:val="20"/>
+          <w:szCs w:val="20"/>
           <w:rtl w:val="0"/>
         </w:rPr>
         <w:t xml:space="preserve">syn_ord_0001</w:t>
       </w:r>
       <w:r>
         <w:rPr>
+          <w:sz w:val="20"/>
+          <w:szCs w:val="20"/>
           <w:rtl w:val="0"/>
         </w:rPr>
         <w:t xml:space="preserve">). Items and the shipping address are embedded in the order document because they are always viewed together with it.</w:t>
@@ -352,20 +470,27 @@
     </w:p>
     <w:p>
       <w:pPr>
-        <w:spacing w:after="200" w:before="200" w:line="360" w:lineRule="auto"/>
+        <w:spacing w:after="200" w:before="200" w:line="276" w:lineRule="auto"/>
         <w:ind w:left="720" w:firstLine="0"/>
-        <w:rPr/>
-      </w:pPr>
-      <w:r>
-        <w:rPr>
-          <w:b w:val="1"/>
-          <w:bCs w:val="1"/>
+        <w:rPr>
+          <w:sz w:val="20"/>
+          <w:szCs w:val="20"/>
+        </w:rPr>
+      </w:pPr>
+      <w:r>
+        <w:rPr>
+          <w:b w:val="1"/>
+          <w:bCs w:val="1"/>
+          <w:sz w:val="20"/>
+          <w:szCs w:val="20"/>
           <w:rtl w:val="0"/>
         </w:rPr>
         <w:t xml:space="preserve">MySQL (for comparison):</w:t>
       </w:r>
       <w:r>
         <w:rPr>
+          <w:sz w:val="20"/>
+          <w:szCs w:val="20"/>
           <w:rtl w:val="0"/>
         </w:rPr>
         <w:t xml:space="preserve"> Two tables: i) </w:t>
@@ -374,6 +499,8 @@
         <w:rPr>
           <w:i w:val="1"/>
           <w:iCs w:val="1"/>
+          <w:sz w:val="20"/>
+          <w:szCs w:val="20"/>
           <w:rtl w:val="0"/>
         </w:rPr>
         <w:t xml:space="preserve">orders</w:t>
@@ -382,12 +509,16 @@
         <w:rPr>
           <w:i w:val="1"/>
           <w:iCs w:val="1"/>
+          <w:sz w:val="20"/>
+          <w:szCs w:val="20"/>
           <w:rtl w:val="0"/>
         </w:rPr>
         <w:t xml:space="preserve"> </w:t>
       </w:r>
       <w:r>
         <w:rPr>
+          <w:sz w:val="20"/>
+          <w:szCs w:val="20"/>
           <w:rtl w:val="0"/>
         </w:rPr>
         <w:t xml:space="preserve">has one row per order. ii) </w:t>
@@ -396,6 +527,8 @@
         <w:rPr>
           <w:i w:val="1"/>
           <w:iCs w:val="1"/>
+          <w:sz w:val="20"/>
+          <w:szCs w:val="20"/>
           <w:rtl w:val="0"/>
         </w:rPr>
         <w:t xml:space="preserve">order_items</w:t>
@@ -404,12 +537,16 @@
         <w:rPr>
           <w:i w:val="1"/>
           <w:iCs w:val="1"/>
+          <w:sz w:val="20"/>
+          <w:szCs w:val="20"/>
           <w:rtl w:val="0"/>
         </w:rPr>
         <w:t xml:space="preserve"> </w:t>
       </w:r>
       <w:r>
         <w:rPr>
+          <w:sz w:val="20"/>
+          <w:szCs w:val="20"/>
           <w:rtl w:val="0"/>
         </w:rPr>
         <w:t xml:space="preserve">has one row per item. The tables are linked by order ID (primary key/foreign key).</w:t>
@@ -417,12 +554,17 @@
     </w:p>
     <w:p>
       <w:pPr>
-        <w:spacing w:after="200" w:before="200" w:line="360" w:lineRule="auto"/>
+        <w:spacing w:after="200" w:before="200" w:line="276" w:lineRule="auto"/>
         <w:ind w:left="720" w:firstLine="0"/>
-        <w:rPr/>
-      </w:pPr>
-      <w:r>
-        <w:rPr>
+        <w:rPr>
+          <w:sz w:val="20"/>
+          <w:szCs w:val="20"/>
+        </w:rPr>
+      </w:pPr>
+      <w:r>
+        <w:rPr>
+          <w:sz w:val="20"/>
+          <w:szCs w:val="20"/>
           <w:rtl w:val="0"/>
         </w:rPr>
         <w:t xml:space="preserve">The model may be refined once implementation begins.</w:t>
@@ -434,17 +576,21 @@
           <w:ilvl w:val="0"/>
           <w:numId w:val="3"/>
         </w:numPr>
-        <w:spacing w:after="200" w:before="200" w:line="360" w:lineRule="auto"/>
+        <w:spacing w:after="200" w:before="200" w:line="276" w:lineRule="auto"/>
         <w:ind w:left="720" w:hanging="360"/>
         <w:rPr>
           <w:b w:val="1"/>
           <w:bCs w:val="1"/>
-        </w:rPr>
-      </w:pPr>
-      <w:r>
-        <w:rPr>
-          <w:b w:val="1"/>
-          <w:bCs w:val="1"/>
+          <w:sz w:val="20"/>
+          <w:szCs w:val="20"/>
+        </w:rPr>
+      </w:pPr>
+      <w:r>
+        <w:rPr>
+          <w:b w:val="1"/>
+          <w:bCs w:val="1"/>
+          <w:sz w:val="20"/>
+          <w:szCs w:val="20"/>
           <w:rtl w:val="0"/>
         </w:rPr>
         <w:t xml:space="preserve">Preliminary architecture/data-flow diagram.</w:t>
@@ -452,17 +598,21 @@
     </w:p>
     <w:p>
       <w:pPr>
-        <w:spacing w:after="200" w:before="200" w:line="360" w:lineRule="auto"/>
+        <w:spacing w:after="200" w:before="200" w:line="276" w:lineRule="auto"/>
         <w:ind w:left="720" w:firstLine="0"/>
         <w:rPr>
           <w:b w:val="1"/>
           <w:bCs w:val="1"/>
-        </w:rPr>
-      </w:pPr>
-      <w:r>
-        <w:rPr>
-          <w:b w:val="1"/>
-          <w:bCs w:val="1"/>
+          <w:sz w:val="20"/>
+          <w:szCs w:val="20"/>
+        </w:rPr>
+      </w:pPr>
+      <w:r>
+        <w:rPr>
+          <w:b w:val="1"/>
+          <w:bCs w:val="1"/>
+          <w:sz w:val="20"/>
+          <w:szCs w:val="20"/>
           <w:rtl w:val="0"/>
         </w:rPr>
         <w:t xml:space="preserve">Preliminary Data Model</w:t>
@@ -474,22 +624,27 @@
           <w:ilvl w:val="0"/>
           <w:numId w:val="2"/>
         </w:numPr>
-        <w:spacing w:after="0" w:afterAutospacing="0" w:before="200" w:line="360" w:lineRule="auto"/>
+        <w:spacing w:after="0" w:afterAutospacing="0" w:before="200" w:line="276" w:lineRule="auto"/>
         <w:ind w:left="720" w:hanging="360"/>
         <w:rPr>
-          <w:u w:val="none"/>
-        </w:rPr>
-      </w:pPr>
-      <w:r>
-        <w:rPr>
-          <w:b w:val="1"/>
-          <w:bCs w:val="1"/>
+          <w:sz w:val="20"/>
+          <w:szCs w:val="20"/>
+        </w:rPr>
+      </w:pPr>
+      <w:r>
+        <w:rPr>
+          <w:b w:val="1"/>
+          <w:bCs w:val="1"/>
+          <w:sz w:val="20"/>
+          <w:szCs w:val="20"/>
           <w:rtl w:val="0"/>
         </w:rPr>
         <w:t xml:space="preserve">CouchDB</w:t>
       </w:r>
       <w:r>
         <w:rPr>
+          <w:sz w:val="20"/>
+          <w:szCs w:val="20"/>
           <w:rtl w:val="0"/>
         </w:rPr>
         <w:t xml:space="preserve">: one database with one document per order. The items and the address are kept inside the order document, because they are always viewed together with the order.</w:t>
@@ -501,22 +656,27 @@
           <w:ilvl w:val="0"/>
           <w:numId w:val="2"/>
         </w:numPr>
-        <w:spacing w:after="200" w:before="0" w:beforeAutospacing="0" w:line="360" w:lineRule="auto"/>
+        <w:spacing w:after="200" w:before="0" w:beforeAutospacing="0" w:line="276" w:lineRule="auto"/>
         <w:ind w:left="720" w:hanging="360"/>
         <w:rPr>
-          <w:u w:val="none"/>
-        </w:rPr>
-      </w:pPr>
-      <w:r>
-        <w:rPr>
-          <w:b w:val="1"/>
-          <w:bCs w:val="1"/>
+          <w:sz w:val="20"/>
+          <w:szCs w:val="20"/>
+        </w:rPr>
+      </w:pPr>
+      <w:r>
+        <w:rPr>
+          <w:b w:val="1"/>
+          <w:bCs w:val="1"/>
+          <w:sz w:val="20"/>
+          <w:szCs w:val="20"/>
           <w:rtl w:val="0"/>
         </w:rPr>
         <w:t xml:space="preserve">MySQL</w:t>
       </w:r>
       <w:r>
         <w:rPr>
+          <w:sz w:val="20"/>
+          <w:szCs w:val="20"/>
           <w:rtl w:val="0"/>
         </w:rPr>
         <w:t xml:space="preserve">: two tables. The orders table has one row per order, and the order_items table has one row per item. The two tables are linked by the order ID (primary key and foreign key).</w:t>
@@ -524,20 +684,28 @@
     </w:p>
     <w:p>
       <w:pPr>
-        <w:spacing w:after="200" w:before="200" w:line="360" w:lineRule="auto"/>
+        <w:spacing w:after="200" w:before="200" w:line="276" w:lineRule="auto"/>
         <w:ind w:left="720" w:firstLine="0"/>
-        <w:rPr/>
-      </w:pPr>
-      <w:r>
-        <w:rPr>
-          <w:b w:val="1"/>
-          <w:bCs w:val="1"/>
+        <w:rPr>
+          <w:sz w:val="20"/>
+          <w:szCs w:val="20"/>
+        </w:rPr>
+      </w:pPr>
+      <w:r>
+        <w:rPr>
+          <w:b w:val="1"/>
+          <w:bCs w:val="1"/>
+          <w:sz w:val="20"/>
+          <w:szCs w:val="20"/>
           <w:rtl w:val="0"/>
         </w:rPr>
         <w:t xml:space="preserve">Architecture / Data Flow</w:t>
       </w:r>
       <w:r>
-        <w:rPr/>
+        <w:rPr>
+          <w:sz w:val="20"/>
+          <w:szCs w:val="20"/>
+        </w:rPr>
         <w:drawing>
           <wp:inline distB="114300" distT="114300" distL="114300" distR="114300">
             <wp:extent cx="5433488" cy="2167347"/>
@@ -579,12 +747,17 @@
     </w:p>
     <w:p>
       <w:pPr>
-        <w:spacing w:after="200" w:before="200" w:line="360" w:lineRule="auto"/>
+        <w:spacing w:after="200" w:before="200" w:line="276" w:lineRule="auto"/>
         <w:ind w:left="720" w:firstLine="0"/>
-        <w:rPr/>
-      </w:pPr>
-      <w:r>
-        <w:rPr>
+        <w:rPr>
+          <w:sz w:val="20"/>
+          <w:szCs w:val="20"/>
+        </w:rPr>
+      </w:pPr>
+      <w:r>
+        <w:rPr>
+          <w:sz w:val="20"/>
+          <w:szCs w:val="20"/>
           <w:rtl w:val="0"/>
         </w:rPr>
         <w:t xml:space="preserve">The ShopTrack dataset (500 synthetic orders) is split into a JSON file, imported into CouchDB over HTTP via _bulk_docs, and a SQL file, run as a script into MySQL. The same tasks are then run on both databases and compared: CRUD on a test order, 4+ business queries, indexes, and revisions (CouchDB only). </w:t>
@@ -596,17 +769,21 @@
           <w:ilvl w:val="0"/>
           <w:numId w:val="3"/>
         </w:numPr>
-        <w:spacing w:after="200" w:before="200" w:line="360" w:lineRule="auto"/>
+        <w:spacing w:after="200" w:before="200" w:line="276" w:lineRule="auto"/>
         <w:ind w:left="720" w:hanging="360"/>
         <w:rPr>
           <w:b w:val="1"/>
           <w:bCs w:val="1"/>
-        </w:rPr>
-      </w:pPr>
-      <w:r>
-        <w:rPr>
-          <w:b w:val="1"/>
-          <w:bCs w:val="1"/>
+          <w:sz w:val="20"/>
+          <w:szCs w:val="20"/>
+        </w:rPr>
+      </w:pPr>
+      <w:r>
+        <w:rPr>
+          <w:b w:val="1"/>
+          <w:bCs w:val="1"/>
+          <w:sz w:val="20"/>
+          <w:szCs w:val="20"/>
           <w:rtl w:val="0"/>
         </w:rPr>
         <w:t xml:space="preserve">Short preliminary comparison with MySQL: why might this scenario benefit from the assigned NoSQL database?</w:t>
@@ -670,13 +847,18 @@
           </w:tcPr>
           <w:p>
             <w:pPr>
-              <w:spacing w:after="200" w:before="200" w:line="360" w:lineRule="auto"/>
-              <w:rPr/>
+              <w:spacing w:after="200" w:before="200" w:line="240" w:lineRule="auto"/>
+              <w:rPr>
+                <w:sz w:val="20"/>
+                <w:szCs w:val="20"/>
+              </w:rPr>
             </w:pPr>
             <w:r>
               <w:rPr>
                 <w:b w:val="1"/>
                 <w:bCs w:val="1"/>
+                <w:sz w:val="20"/>
+                <w:szCs w:val="20"/>
                 <w:rtl w:val="0"/>
               </w:rPr>
               <w:t xml:space="preserve">Topic</w:t>
@@ -707,13 +889,18 @@
           </w:tcPr>
           <w:p>
             <w:pPr>
-              <w:spacing w:after="200" w:before="200" w:line="360" w:lineRule="auto"/>
-              <w:rPr/>
+              <w:spacing w:after="200" w:before="200" w:line="240" w:lineRule="auto"/>
+              <w:rPr>
+                <w:sz w:val="20"/>
+                <w:szCs w:val="20"/>
+              </w:rPr>
             </w:pPr>
             <w:r>
               <w:rPr>
                 <w:b w:val="1"/>
                 <w:bCs w:val="1"/>
+                <w:sz w:val="20"/>
+                <w:szCs w:val="20"/>
                 <w:rtl w:val="0"/>
               </w:rPr>
               <w:t xml:space="preserve">CouchDB</w:t>
@@ -744,13 +931,18 @@
           </w:tcPr>
           <w:p>
             <w:pPr>
-              <w:spacing w:after="200" w:before="200" w:line="360" w:lineRule="auto"/>
-              <w:rPr/>
+              <w:spacing w:after="200" w:before="200" w:line="240" w:lineRule="auto"/>
+              <w:rPr>
+                <w:sz w:val="20"/>
+                <w:szCs w:val="20"/>
+              </w:rPr>
             </w:pPr>
             <w:r>
               <w:rPr>
                 <w:b w:val="1"/>
                 <w:bCs w:val="1"/>
+                <w:sz w:val="20"/>
+                <w:szCs w:val="20"/>
                 <w:rtl w:val="0"/>
               </w:rPr>
               <w:t xml:space="preserve">MySQL</w:t>
@@ -787,16 +979,16 @@
           </w:tcPr>
           <w:p>
             <w:pPr>
-              <w:spacing w:after="0" w:before="0" w:line="360" w:lineRule="auto"/>
-              <w:rPr>
-                <w:sz w:val="20"/>
-                <w:szCs w:val="20"/>
+              <w:spacing w:after="0" w:before="0" w:line="240" w:lineRule="auto"/>
+              <w:rPr>
+                <w:sz w:val="18"/>
+                <w:szCs w:val="18"/>
               </w:rPr>
             </w:pPr>
             <w:r>
               <w:rPr>
-                <w:sz w:val="20"/>
-                <w:szCs w:val="20"/>
+                <w:sz w:val="18"/>
+                <w:szCs w:val="18"/>
                 <w:rtl w:val="0"/>
               </w:rPr>
               <w:t xml:space="preserve">How an order is stored</w:t>
@@ -821,16 +1013,16 @@
           </w:tcPr>
           <w:p>
             <w:pPr>
-              <w:spacing w:after="0" w:before="0" w:line="360" w:lineRule="auto"/>
-              <w:rPr>
-                <w:sz w:val="20"/>
-                <w:szCs w:val="20"/>
+              <w:spacing w:after="0" w:before="0" w:line="240" w:lineRule="auto"/>
+              <w:rPr>
+                <w:sz w:val="18"/>
+                <w:szCs w:val="18"/>
               </w:rPr>
             </w:pPr>
             <w:r>
               <w:rPr>
-                <w:sz w:val="20"/>
-                <w:szCs w:val="20"/>
+                <w:sz w:val="18"/>
+                <w:szCs w:val="18"/>
                 <w:rtl w:val="0"/>
               </w:rPr>
               <w:t xml:space="preserve">One JSON document with items inside</w:t>
@@ -855,16 +1047,16 @@
           </w:tcPr>
           <w:p>
             <w:pPr>
-              <w:spacing w:after="0" w:before="0" w:line="360" w:lineRule="auto"/>
-              <w:rPr>
-                <w:sz w:val="20"/>
-                <w:szCs w:val="20"/>
+              <w:spacing w:after="0" w:before="0" w:line="240" w:lineRule="auto"/>
+              <w:rPr>
+                <w:sz w:val="18"/>
+                <w:szCs w:val="18"/>
               </w:rPr>
             </w:pPr>
             <w:r>
               <w:rPr>
-                <w:sz w:val="20"/>
-                <w:szCs w:val="20"/>
+                <w:sz w:val="18"/>
+                <w:szCs w:val="18"/>
                 <w:rtl w:val="0"/>
               </w:rPr>
               <w:t xml:space="preserve">Split into </w:t>
@@ -873,8 +1065,8 @@
               <w:rPr>
                 <w:i w:val="1"/>
                 <w:iCs w:val="1"/>
-                <w:sz w:val="20"/>
-                <w:szCs w:val="20"/>
+                <w:sz w:val="18"/>
+                <w:szCs w:val="18"/>
                 <w:rtl w:val="0"/>
               </w:rPr>
               <w:t xml:space="preserve">orders</w:t>
@@ -883,16 +1075,16 @@
               <w:rPr>
                 <w:i w:val="1"/>
                 <w:iCs w:val="1"/>
-                <w:sz w:val="20"/>
-                <w:szCs w:val="20"/>
+                <w:sz w:val="18"/>
+                <w:szCs w:val="18"/>
                 <w:rtl w:val="0"/>
               </w:rPr>
               <w:t xml:space="preserve"> </w:t>
             </w:r>
             <w:r>
               <w:rPr>
-                <w:sz w:val="20"/>
-                <w:szCs w:val="20"/>
+                <w:sz w:val="18"/>
+                <w:szCs w:val="18"/>
                 <w:rtl w:val="0"/>
               </w:rPr>
               <w:t xml:space="preserve">and </w:t>
@@ -901,8 +1093,8 @@
               <w:rPr>
                 <w:i w:val="1"/>
                 <w:iCs w:val="1"/>
-                <w:sz w:val="20"/>
-                <w:szCs w:val="20"/>
+                <w:sz w:val="18"/>
+                <w:szCs w:val="18"/>
                 <w:rtl w:val="0"/>
               </w:rPr>
               <w:t xml:space="preserve">order_items</w:t>
@@ -911,16 +1103,16 @@
               <w:rPr>
                 <w:i w:val="1"/>
                 <w:iCs w:val="1"/>
-                <w:sz w:val="20"/>
-                <w:szCs w:val="20"/>
+                <w:sz w:val="18"/>
+                <w:szCs w:val="18"/>
                 <w:rtl w:val="0"/>
               </w:rPr>
               <w:t xml:space="preserve"> </w:t>
             </w:r>
             <w:r>
               <w:rPr>
-                <w:sz w:val="20"/>
-                <w:szCs w:val="20"/>
+                <w:sz w:val="18"/>
+                <w:szCs w:val="18"/>
                 <w:rtl w:val="0"/>
               </w:rPr>
               <w:t xml:space="preserve">tables</w:t>
@@ -952,16 +1144,16 @@
           </w:tcPr>
           <w:p>
             <w:pPr>
-              <w:spacing w:after="0" w:before="0" w:line="360" w:lineRule="auto"/>
-              <w:rPr>
-                <w:sz w:val="20"/>
-                <w:szCs w:val="20"/>
+              <w:spacing w:after="0" w:before="0" w:line="240" w:lineRule="auto"/>
+              <w:rPr>
+                <w:sz w:val="18"/>
+                <w:szCs w:val="18"/>
               </w:rPr>
             </w:pPr>
             <w:r>
               <w:rPr>
-                <w:sz w:val="20"/>
-                <w:szCs w:val="20"/>
+                <w:sz w:val="18"/>
+                <w:szCs w:val="18"/>
                 <w:rtl w:val="0"/>
               </w:rPr>
               <w:t xml:space="preserve">Getting a full order</w:t>
@@ -986,16 +1178,16 @@
           </w:tcPr>
           <w:p>
             <w:pPr>
-              <w:spacing w:after="0" w:before="0" w:line="360" w:lineRule="auto"/>
-              <w:rPr>
-                <w:sz w:val="20"/>
-                <w:szCs w:val="20"/>
+              <w:spacing w:after="0" w:before="0" w:line="240" w:lineRule="auto"/>
+              <w:rPr>
+                <w:sz w:val="18"/>
+                <w:szCs w:val="18"/>
               </w:rPr>
             </w:pPr>
             <w:r>
               <w:rPr>
-                <w:sz w:val="20"/>
-                <w:szCs w:val="20"/>
+                <w:sz w:val="18"/>
+                <w:szCs w:val="18"/>
                 <w:rtl w:val="0"/>
               </w:rPr>
               <w:t xml:space="preserve">One request by order ID</w:t>
@@ -1020,16 +1212,16 @@
           </w:tcPr>
           <w:p>
             <w:pPr>
-              <w:spacing w:after="0" w:before="0" w:line="360" w:lineRule="auto"/>
-              <w:rPr>
-                <w:sz w:val="20"/>
-                <w:szCs w:val="20"/>
+              <w:spacing w:after="0" w:before="0" w:line="240" w:lineRule="auto"/>
+              <w:rPr>
+                <w:sz w:val="18"/>
+                <w:szCs w:val="18"/>
               </w:rPr>
             </w:pPr>
             <w:r>
               <w:rPr>
-                <w:sz w:val="20"/>
-                <w:szCs w:val="20"/>
+                <w:sz w:val="18"/>
+                <w:szCs w:val="18"/>
                 <w:rtl w:val="0"/>
               </w:rPr>
               <w:t xml:space="preserve">Join the two tables</w:t>
@@ -1061,16 +1253,16 @@
           </w:tcPr>
           <w:p>
             <w:pPr>
-              <w:spacing w:after="0" w:before="0" w:line="360" w:lineRule="auto"/>
-              <w:rPr>
-                <w:sz w:val="20"/>
-                <w:szCs w:val="20"/>
+              <w:spacing w:after="0" w:before="0" w:line="240" w:lineRule="auto"/>
+              <w:rPr>
+                <w:sz w:val="18"/>
+                <w:szCs w:val="18"/>
               </w:rPr>
             </w:pPr>
             <w:r>
               <w:rPr>
-                <w:sz w:val="20"/>
-                <w:szCs w:val="20"/>
+                <w:sz w:val="18"/>
+                <w:szCs w:val="18"/>
                 <w:rtl w:val="0"/>
               </w:rPr>
               <w:t xml:space="preserve">Structure rules</w:t>
@@ -1095,16 +1287,16 @@
           </w:tcPr>
           <w:p>
             <w:pPr>
-              <w:spacing w:after="0" w:before="0" w:line="360" w:lineRule="auto"/>
-              <w:rPr>
-                <w:sz w:val="20"/>
-                <w:szCs w:val="20"/>
+              <w:spacing w:after="0" w:before="0" w:line="240" w:lineRule="auto"/>
+              <w:rPr>
+                <w:sz w:val="18"/>
+                <w:szCs w:val="18"/>
               </w:rPr>
             </w:pPr>
             <w:r>
               <w:rPr>
-                <w:sz w:val="20"/>
-                <w:szCs w:val="20"/>
+                <w:sz w:val="18"/>
+                <w:szCs w:val="18"/>
                 <w:rtl w:val="0"/>
               </w:rPr>
               <w:t xml:space="preserve">Flexible; documents can differ</w:t>
@@ -1129,16 +1321,16 @@
           </w:tcPr>
           <w:p>
             <w:pPr>
-              <w:spacing w:after="0" w:before="0" w:line="360" w:lineRule="auto"/>
-              <w:rPr>
-                <w:sz w:val="20"/>
-                <w:szCs w:val="20"/>
+              <w:spacing w:after="0" w:before="0" w:line="240" w:lineRule="auto"/>
+              <w:rPr>
+                <w:sz w:val="18"/>
+                <w:szCs w:val="18"/>
               </w:rPr>
             </w:pPr>
             <w:r>
               <w:rPr>
-                <w:sz w:val="20"/>
-                <w:szCs w:val="20"/>
+                <w:sz w:val="18"/>
+                <w:szCs w:val="18"/>
                 <w:rtl w:val="0"/>
               </w:rPr>
               <w:t xml:space="preserve">Fixed schema with keys</w:t>
@@ -1149,7 +1341,7 @@
       <w:tr>
         <w:trPr>
           <w:cantSplit w:val="0"/>
-          <w:trHeight w:val="785" w:hRule="atLeast"/>
+          <w:trHeight w:val="458.96484375" w:hRule="atLeast"/>
           <w:tblHeader w:val="0"/>
         </w:trPr>
         <w:tc>
@@ -1170,16 +1362,16 @@
           </w:tcPr>
           <w:p>
             <w:pPr>
-              <w:spacing w:after="0" w:before="0" w:line="360" w:lineRule="auto"/>
-              <w:rPr>
-                <w:sz w:val="20"/>
-                <w:szCs w:val="20"/>
+              <w:spacing w:after="0" w:before="0" w:line="240" w:lineRule="auto"/>
+              <w:rPr>
+                <w:sz w:val="18"/>
+                <w:szCs w:val="18"/>
               </w:rPr>
             </w:pPr>
             <w:r>
               <w:rPr>
-                <w:sz w:val="20"/>
-                <w:szCs w:val="20"/>
+                <w:sz w:val="18"/>
+                <w:szCs w:val="18"/>
                 <w:rtl w:val="0"/>
               </w:rPr>
               <w:t xml:space="preserve">Handling changes</w:t>
@@ -1204,16 +1396,16 @@
           </w:tcPr>
           <w:p>
             <w:pPr>
-              <w:spacing w:after="0" w:before="0" w:line="360" w:lineRule="auto"/>
-              <w:rPr>
-                <w:sz w:val="20"/>
-                <w:szCs w:val="20"/>
+              <w:spacing w:after="0" w:before="0" w:line="240" w:lineRule="auto"/>
+              <w:rPr>
+                <w:sz w:val="18"/>
+                <w:szCs w:val="18"/>
               </w:rPr>
             </w:pPr>
             <w:r>
               <w:rPr>
-                <w:sz w:val="20"/>
-                <w:szCs w:val="20"/>
+                <w:sz w:val="18"/>
+                <w:szCs w:val="18"/>
                 <w:rtl w:val="0"/>
               </w:rPr>
               <w:t xml:space="preserve">Each document has a revision number (_rev)</w:t>
@@ -1238,16 +1430,16 @@
           </w:tcPr>
           <w:p>
             <w:pPr>
-              <w:spacing w:after="0" w:before="0" w:line="360" w:lineRule="auto"/>
-              <w:rPr>
-                <w:sz w:val="20"/>
-                <w:szCs w:val="20"/>
+              <w:spacing w:after="0" w:before="0" w:line="240" w:lineRule="auto"/>
+              <w:rPr>
+                <w:sz w:val="18"/>
+                <w:szCs w:val="18"/>
               </w:rPr>
             </w:pPr>
             <w:r>
               <w:rPr>
-                <w:sz w:val="20"/>
-                <w:szCs w:val="20"/>
+                <w:sz w:val="18"/>
+                <w:szCs w:val="18"/>
                 <w:rtl w:val="0"/>
               </w:rPr>
               <w:t xml:space="preserve">Transactions and locking</w:t>
@@ -1264,10 +1456,15 @@
         </w:numPr>
         <w:spacing w:after="0" w:afterAutospacing="0" w:before="240" w:line="360" w:lineRule="auto"/>
         <w:ind w:left="720" w:hanging="360"/>
-        <w:rPr/>
-      </w:pPr>
-      <w:r>
-        <w:rPr>
+        <w:rPr>
+          <w:sz w:val="20"/>
+          <w:szCs w:val="20"/>
+        </w:rPr>
+      </w:pPr>
+      <w:r>
+        <w:rPr>
+          <w:sz w:val="20"/>
+          <w:szCs w:val="20"/>
           <w:rtl w:val="0"/>
         </w:rPr>
         <w:t xml:space="preserve">CouchDB is expected to be simpler for saving and reading complete orders.</w:t>
@@ -1281,10 +1478,15 @@
         </w:numPr>
         <w:spacing w:after="0" w:afterAutospacing="0" w:before="0" w:beforeAutospacing="0" w:line="360" w:lineRule="auto"/>
         <w:ind w:left="720" w:hanging="360"/>
-        <w:rPr/>
-      </w:pPr>
-      <w:r>
-        <w:rPr>
+        <w:rPr>
+          <w:sz w:val="20"/>
+          <w:szCs w:val="20"/>
+        </w:rPr>
+      </w:pPr>
+      <w:r>
+        <w:rPr>
+          <w:sz w:val="20"/>
+          <w:szCs w:val="20"/>
           <w:rtl w:val="0"/>
         </w:rPr>
         <w:t xml:space="preserve">MySQL is expected to be stronger for reports across many orders.</w:t>
@@ -1298,10 +1500,15 @@
         </w:numPr>
         <w:spacing w:after="0" w:afterAutospacing="0" w:before="0" w:beforeAutospacing="0" w:line="360" w:lineRule="auto"/>
         <w:ind w:left="720" w:hanging="360"/>
-        <w:rPr/>
-      </w:pPr>
-      <w:r>
-        <w:rPr>
+        <w:rPr>
+          <w:sz w:val="20"/>
+          <w:szCs w:val="20"/>
+        </w:rPr>
+      </w:pPr>
+      <w:r>
+        <w:rPr>
+          <w:sz w:val="20"/>
+          <w:szCs w:val="20"/>
           <w:rtl w:val="0"/>
         </w:rPr>
         <w:t xml:space="preserve">The final recommendation will be made after testing.</w:t>
@@ -1315,10 +1522,15 @@
         </w:numPr>
         <w:spacing w:after="0" w:afterAutospacing="0" w:before="0" w:beforeAutospacing="0" w:line="360" w:lineRule="auto"/>
         <w:ind w:left="720" w:hanging="360"/>
-        <w:rPr/>
-      </w:pPr>
-      <w:r>
-        <w:rPr>
+        <w:rPr>
+          <w:sz w:val="20"/>
+          <w:szCs w:val="20"/>
+        </w:rPr>
+      </w:pPr>
+      <w:r>
+        <w:rPr>
+          <w:sz w:val="20"/>
+          <w:szCs w:val="20"/>
           <w:rtl w:val="0"/>
         </w:rPr>
         <w:t xml:space="preserve">The final report will also compare CouchDB with MongoDB.</w:t>
@@ -1340,12 +1552,16 @@
         <w:rPr>
           <w:b w:val="1"/>
           <w:bCs w:val="1"/>
-        </w:rPr>
-      </w:pPr>
-      <w:r>
-        <w:rPr>
-          <w:b w:val="1"/>
-          <w:bCs w:val="1"/>
+          <w:sz w:val="20"/>
+          <w:szCs w:val="20"/>
+        </w:rPr>
+      </w:pPr>
+      <w:r>
+        <w:rPr>
+          <w:b w:val="1"/>
+          <w:bCs w:val="1"/>
+          <w:sz w:val="20"/>
+          <w:szCs w:val="20"/>
           <w:rtl w:val="0"/>
         </w:rPr>
         <w:t xml:space="preserve">Responsibility matrix showing each member’s primary responsibility.</w:t>
@@ -1413,12 +1629,17 @@
             <w:pPr>
               <w:spacing w:after="0" w:before="0" w:line="276" w:lineRule="auto"/>
               <w:jc w:val="center"/>
-              <w:rPr/>
+              <w:rPr>
+                <w:sz w:val="20"/>
+                <w:szCs w:val="20"/>
+              </w:rPr>
             </w:pPr>
             <w:r>
               <w:rPr>
                 <w:b w:val="1"/>
                 <w:bCs w:val="1"/>
+                <w:sz w:val="20"/>
+                <w:szCs w:val="20"/>
                 <w:rtl w:val="0"/>
               </w:rPr>
               <w:t xml:space="preserve">Member</w:t>
@@ -1451,12 +1672,17 @@
             <w:pPr>
               <w:spacing w:after="0" w:before="0" w:line="276" w:lineRule="auto"/>
               <w:jc w:val="center"/>
-              <w:rPr/>
+              <w:rPr>
+                <w:sz w:val="20"/>
+                <w:szCs w:val="20"/>
+              </w:rPr>
             </w:pPr>
             <w:r>
               <w:rPr>
                 <w:b w:val="1"/>
                 <w:bCs w:val="1"/>
+                <w:sz w:val="20"/>
+                <w:szCs w:val="20"/>
                 <w:rtl w:val="0"/>
               </w:rPr>
               <w:t xml:space="preserve">Main task (project work)</w:t>
@@ -1489,12 +1715,17 @@
             <w:pPr>
               <w:spacing w:after="0" w:before="0" w:line="276" w:lineRule="auto"/>
               <w:jc w:val="center"/>
-              <w:rPr/>
+              <w:rPr>
+                <w:sz w:val="20"/>
+                <w:szCs w:val="20"/>
+              </w:rPr>
             </w:pPr>
             <w:r>
               <w:rPr>
                 <w:b w:val="1"/>
                 <w:bCs w:val="1"/>
+                <w:sz w:val="20"/>
+                <w:szCs w:val="20"/>
                 <w:rtl w:val="0"/>
               </w:rPr>
               <w:t xml:space="preserve">Presentation (slides)</w:t>
@@ -1527,12 +1758,17 @@
             <w:pPr>
               <w:spacing w:after="0" w:before="0" w:line="276" w:lineRule="auto"/>
               <w:jc w:val="center"/>
-              <w:rPr/>
+              <w:rPr>
+                <w:sz w:val="20"/>
+                <w:szCs w:val="20"/>
+              </w:rPr>
             </w:pPr>
             <w:r>
               <w:rPr>
                 <w:b w:val="1"/>
                 <w:bCs w:val="1"/>
+                <w:sz w:val="20"/>
+                <w:szCs w:val="20"/>
                 <w:rtl w:val="0"/>
               </w:rPr>
               <w:t xml:space="preserve">Live demo</w:t>
@@ -1548,7 +1784,7 @@
       <w:tr>
         <w:trPr>
           <w:cantSplit w:val="0"/>
-          <w:trHeight w:val="1610" w:hRule="atLeast"/>
+          <w:trHeight w:val="1065" w:hRule="atLeast"/>
           <w:tblHeader w:val="0"/>
         </w:trPr>
         <w:tc>
@@ -1569,16 +1805,20 @@
           </w:tcPr>
           <w:p>
             <w:pPr>
-              <w:spacing w:after="0" w:before="0" w:line="360" w:lineRule="auto"/>
-              <w:rPr>
-                <w:sz w:val="20"/>
-                <w:szCs w:val="20"/>
+              <w:spacing w:after="0" w:before="0" w:line="240" w:lineRule="auto"/>
+              <w:rPr>
+                <w:b w:val="1"/>
+                <w:bCs w:val="1"/>
+                <w:sz w:val="18"/>
+                <w:szCs w:val="18"/>
               </w:rPr>
             </w:pPr>
             <w:r>
               <w:rPr>
-                <w:sz w:val="20"/>
-                <w:szCs w:val="20"/>
+                <w:b w:val="1"/>
+                <w:bCs w:val="1"/>
+                <w:sz w:val="18"/>
+                <w:szCs w:val="18"/>
                 <w:rtl w:val="0"/>
               </w:rPr>
               <w:t xml:space="preserve">Hassan Saleh H Alshamrani</w:t>
@@ -1603,16 +1843,16 @@
           </w:tcPr>
           <w:p>
             <w:pPr>
-              <w:spacing w:after="0" w:before="0" w:line="360" w:lineRule="auto"/>
-              <w:rPr>
-                <w:sz w:val="20"/>
-                <w:szCs w:val="20"/>
+              <w:spacing w:after="0" w:before="0" w:line="240" w:lineRule="auto"/>
+              <w:rPr>
+                <w:sz w:val="18"/>
+                <w:szCs w:val="18"/>
               </w:rPr>
             </w:pPr>
             <w:r>
               <w:rPr>
-                <w:sz w:val="20"/>
-                <w:szCs w:val="20"/>
+                <w:sz w:val="18"/>
+                <w:szCs w:val="18"/>
                 <w:rtl w:val="0"/>
               </w:rPr>
               <w:t xml:space="preserve">Business problem, dataset, architecture diagram; CouchDB technical research (HTTP/REST, security, deployment, licensing); MongoDB comparison</w:t>
@@ -1637,16 +1877,16 @@
           </w:tcPr>
           <w:p>
             <w:pPr>
-              <w:spacing w:after="0" w:before="0" w:line="360" w:lineRule="auto"/>
-              <w:rPr>
-                <w:sz w:val="20"/>
-                <w:szCs w:val="20"/>
+              <w:spacing w:after="0" w:before="0" w:line="240" w:lineRule="auto"/>
+              <w:rPr>
+                <w:sz w:val="18"/>
+                <w:szCs w:val="18"/>
               </w:rPr>
             </w:pPr>
             <w:r>
               <w:rPr>
-                <w:sz w:val="20"/>
-                <w:szCs w:val="20"/>
+                <w:sz w:val="18"/>
+                <w:szCs w:val="18"/>
                 <w:rtl w:val="0"/>
               </w:rPr>
               <w:t xml:space="preserve">Introduction, business problem, dataset; CouchDB vs. MongoDB</w:t>
@@ -1671,16 +1911,16 @@
           </w:tcPr>
           <w:p>
             <w:pPr>
-              <w:spacing w:after="0" w:before="0" w:line="360" w:lineRule="auto"/>
-              <w:rPr>
-                <w:sz w:val="20"/>
-                <w:szCs w:val="20"/>
+              <w:spacing w:after="0" w:before="0" w:line="240" w:lineRule="auto"/>
+              <w:rPr>
+                <w:sz w:val="18"/>
+                <w:szCs w:val="18"/>
               </w:rPr>
             </w:pPr>
             <w:r>
               <w:rPr>
-                <w:sz w:val="20"/>
-                <w:szCs w:val="20"/>
+                <w:sz w:val="18"/>
+                <w:szCs w:val="18"/>
                 <w:rtl w:val="0"/>
               </w:rPr>
               <w:t xml:space="preserve">Add a new order over HTTP and display it</w:t>
@@ -1691,7 +1931,7 @@
       <w:tr>
         <w:trPr>
           <w:cantSplit w:val="0"/>
-          <w:trHeight w:val="1880" w:hRule="atLeast"/>
+          <w:trHeight w:val="1305" w:hRule="atLeast"/>
           <w:tblHeader w:val="0"/>
         </w:trPr>
         <w:tc>
@@ -1712,16 +1952,20 @@
           </w:tcPr>
           <w:p>
             <w:pPr>
-              <w:spacing w:after="0" w:before="0" w:line="360" w:lineRule="auto"/>
-              <w:rPr>
-                <w:sz w:val="20"/>
-                <w:szCs w:val="20"/>
+              <w:spacing w:after="0" w:before="0" w:line="240" w:lineRule="auto"/>
+              <w:rPr>
+                <w:b w:val="1"/>
+                <w:bCs w:val="1"/>
+                <w:sz w:val="18"/>
+                <w:szCs w:val="18"/>
               </w:rPr>
             </w:pPr>
             <w:r>
               <w:rPr>
-                <w:sz w:val="20"/>
-                <w:szCs w:val="20"/>
+                <w:b w:val="1"/>
+                <w:bCs w:val="1"/>
+                <w:sz w:val="18"/>
+                <w:szCs w:val="18"/>
                 <w:rtl w:val="0"/>
               </w:rPr>
               <w:t xml:space="preserve">Damian Mendoza</w:t>
@@ -1746,16 +1990,16 @@
           </w:tcPr>
           <w:p>
             <w:pPr>
-              <w:spacing w:after="0" w:before="0" w:line="360" w:lineRule="auto"/>
-              <w:rPr>
-                <w:sz w:val="20"/>
-                <w:szCs w:val="20"/>
+              <w:spacing w:after="0" w:before="0" w:line="240" w:lineRule="auto"/>
+              <w:rPr>
+                <w:sz w:val="18"/>
+                <w:szCs w:val="18"/>
               </w:rPr>
             </w:pPr>
             <w:r>
               <w:rPr>
-                <w:sz w:val="20"/>
-                <w:szCs w:val="20"/>
+                <w:sz w:val="18"/>
+                <w:szCs w:val="18"/>
                 <w:rtl w:val="0"/>
               </w:rPr>
               <w:t xml:space="preserve">Install CouchDB &amp; MySQL, import data, set up MySQL tables; MySQL comparison: relational mapping (tables, primary/foreign keys, joins vs. embedded documents)</w:t>
@@ -1780,16 +2024,16 @@
           </w:tcPr>
           <w:p>
             <w:pPr>
-              <w:spacing w:after="0" w:before="0" w:line="360" w:lineRule="auto"/>
-              <w:rPr>
-                <w:sz w:val="20"/>
-                <w:szCs w:val="20"/>
+              <w:spacing w:after="0" w:before="0" w:line="240" w:lineRule="auto"/>
+              <w:rPr>
+                <w:sz w:val="18"/>
+                <w:szCs w:val="18"/>
               </w:rPr>
             </w:pPr>
             <w:r>
               <w:rPr>
-                <w:sz w:val="20"/>
-                <w:szCs w:val="20"/>
+                <w:sz w:val="18"/>
+                <w:szCs w:val="18"/>
                 <w:rtl w:val="0"/>
               </w:rPr>
               <w:t xml:space="preserve">Data model: CouchDB documents vs. MySQL tables</w:t>
@@ -1814,16 +2058,16 @@
           </w:tcPr>
           <w:p>
             <w:pPr>
-              <w:spacing w:after="0" w:before="0" w:line="360" w:lineRule="auto"/>
-              <w:rPr>
-                <w:sz w:val="20"/>
-                <w:szCs w:val="20"/>
+              <w:spacing w:after="0" w:before="0" w:line="240" w:lineRule="auto"/>
+              <w:rPr>
+                <w:sz w:val="18"/>
+                <w:szCs w:val="18"/>
               </w:rPr>
             </w:pPr>
             <w:r>
               <w:rPr>
-                <w:sz w:val="20"/>
-                <w:szCs w:val="20"/>
+                <w:sz w:val="18"/>
+                <w:szCs w:val="18"/>
                 <w:rtl w:val="0"/>
               </w:rPr>
               <w:t xml:space="preserve">Show loaded data in both databases; run the business queries in MySQL</w:t>
@@ -1834,7 +2078,7 @@
       <w:tr>
         <w:trPr>
           <w:cantSplit w:val="0"/>
-          <w:trHeight w:val="1610" w:hRule="atLeast"/>
+          <w:trHeight w:val="1110" w:hRule="atLeast"/>
           <w:tblHeader w:val="0"/>
         </w:trPr>
         <w:tc>
@@ -1855,16 +2099,20 @@
           </w:tcPr>
           <w:p>
             <w:pPr>
-              <w:spacing w:after="0" w:before="0" w:line="360" w:lineRule="auto"/>
-              <w:rPr>
-                <w:sz w:val="20"/>
-                <w:szCs w:val="20"/>
+              <w:spacing w:after="0" w:before="0" w:line="240" w:lineRule="auto"/>
+              <w:rPr>
+                <w:b w:val="1"/>
+                <w:bCs w:val="1"/>
+                <w:sz w:val="18"/>
+                <w:szCs w:val="18"/>
               </w:rPr>
             </w:pPr>
             <w:r>
               <w:rPr>
-                <w:sz w:val="20"/>
-                <w:szCs w:val="20"/>
+                <w:b w:val="1"/>
+                <w:bCs w:val="1"/>
+                <w:sz w:val="18"/>
+                <w:szCs w:val="18"/>
                 <w:rtl w:val="0"/>
               </w:rPr>
               <w:t xml:space="preserve">Ingri Quevedo</w:t>
@@ -1889,16 +2137,16 @@
           </w:tcPr>
           <w:p>
             <w:pPr>
-              <w:spacing w:after="0" w:before="0" w:line="360" w:lineRule="auto"/>
-              <w:rPr>
-                <w:sz w:val="20"/>
-                <w:szCs w:val="20"/>
+              <w:spacing w:after="0" w:before="0" w:line="240" w:lineRule="auto"/>
+              <w:rPr>
+                <w:sz w:val="18"/>
+                <w:szCs w:val="18"/>
               </w:rPr>
             </w:pPr>
             <w:r>
               <w:rPr>
-                <w:sz w:val="20"/>
-                <w:szCs w:val="20"/>
+                <w:sz w:val="18"/>
+                <w:szCs w:val="18"/>
                 <w:rtl w:val="0"/>
               </w:rPr>
               <w:t xml:space="preserve">Update/delete operations; CouchDB revisions and replication concepts; MySQL comparison: concurrency, transactions, consistency</w:t>
@@ -1923,16 +2171,16 @@
           </w:tcPr>
           <w:p>
             <w:pPr>
-              <w:spacing w:after="0" w:before="0" w:line="360" w:lineRule="auto"/>
-              <w:rPr>
-                <w:sz w:val="20"/>
-                <w:szCs w:val="20"/>
+              <w:spacing w:after="0" w:before="0" w:line="240" w:lineRule="auto"/>
+              <w:rPr>
+                <w:sz w:val="18"/>
+                <w:szCs w:val="18"/>
               </w:rPr>
             </w:pPr>
             <w:r>
               <w:rPr>
-                <w:sz w:val="20"/>
-                <w:szCs w:val="20"/>
+                <w:sz w:val="18"/>
+                <w:szCs w:val="18"/>
                 <w:rtl w:val="0"/>
               </w:rPr>
               <w:t xml:space="preserve">CouchDB features (revisions/MVCC) vs. MySQL transactions and locking</w:t>
@@ -1957,16 +2205,16 @@
           </w:tcPr>
           <w:p>
             <w:pPr>
-              <w:spacing w:after="0" w:before="0" w:line="360" w:lineRule="auto"/>
-              <w:rPr>
-                <w:sz w:val="20"/>
-                <w:szCs w:val="20"/>
+              <w:spacing w:after="0" w:before="0" w:line="240" w:lineRule="auto"/>
+              <w:rPr>
+                <w:sz w:val="18"/>
+                <w:szCs w:val="18"/>
               </w:rPr>
             </w:pPr>
             <w:r>
               <w:rPr>
-                <w:sz w:val="20"/>
-                <w:szCs w:val="20"/>
+                <w:sz w:val="18"/>
+                <w:szCs w:val="18"/>
                 <w:rtl w:val="0"/>
               </w:rPr>
               <w:t xml:space="preserve">Update and delete an order; show how revisions prevent overwriting</w:t>
@@ -1977,7 +2225,7 @@
       <w:tr>
         <w:trPr>
           <w:cantSplit w:val="0"/>
-          <w:trHeight w:val="1610" w:hRule="atLeast"/>
+          <w:trHeight w:val="1005" w:hRule="atLeast"/>
           <w:tblHeader w:val="0"/>
         </w:trPr>
         <w:tc>
@@ -1998,16 +2246,20 @@
           </w:tcPr>
           <w:p>
             <w:pPr>
-              <w:spacing w:after="0" w:before="0" w:line="360" w:lineRule="auto"/>
-              <w:rPr>
-                <w:sz w:val="20"/>
-                <w:szCs w:val="20"/>
+              <w:spacing w:after="0" w:before="0" w:line="240" w:lineRule="auto"/>
+              <w:rPr>
+                <w:b w:val="1"/>
+                <w:bCs w:val="1"/>
+                <w:sz w:val="18"/>
+                <w:szCs w:val="18"/>
               </w:rPr>
             </w:pPr>
             <w:r>
               <w:rPr>
-                <w:sz w:val="20"/>
-                <w:szCs w:val="20"/>
+                <w:b w:val="1"/>
+                <w:bCs w:val="1"/>
+                <w:sz w:val="18"/>
+                <w:szCs w:val="18"/>
                 <w:rtl w:val="0"/>
               </w:rPr>
               <w:t xml:space="preserve">Stephanie Armstrong</w:t>
@@ -2032,16 +2284,16 @@
           </w:tcPr>
           <w:p>
             <w:pPr>
-              <w:spacing w:after="0" w:before="0" w:line="360" w:lineRule="auto"/>
-              <w:rPr>
-                <w:sz w:val="20"/>
-                <w:szCs w:val="20"/>
+              <w:spacing w:after="0" w:before="0" w:line="240" w:lineRule="auto"/>
+              <w:rPr>
+                <w:sz w:val="18"/>
+                <w:szCs w:val="18"/>
               </w:rPr>
             </w:pPr>
             <w:r>
               <w:rPr>
-                <w:sz w:val="20"/>
-                <w:szCs w:val="20"/>
+                <w:sz w:val="18"/>
+                <w:szCs w:val="18"/>
                 <w:rtl w:val="0"/>
               </w:rPr>
               <w:t xml:space="preserve">Business queries (Mango selectors) and indexes; MySQL comparison: querying and indexing, performance; final recommendation</w:t>
@@ -2066,16 +2318,16 @@
           </w:tcPr>
           <w:p>
             <w:pPr>
-              <w:spacing w:after="0" w:before="0" w:line="360" w:lineRule="auto"/>
-              <w:rPr>
-                <w:sz w:val="20"/>
-                <w:szCs w:val="20"/>
+              <w:spacing w:after="0" w:before="0" w:line="240" w:lineRule="auto"/>
+              <w:rPr>
+                <w:sz w:val="18"/>
+                <w:szCs w:val="18"/>
               </w:rPr>
             </w:pPr>
             <w:r>
               <w:rPr>
-                <w:sz w:val="20"/>
-                <w:szCs w:val="20"/>
+                <w:sz w:val="18"/>
+                <w:szCs w:val="18"/>
                 <w:rtl w:val="0"/>
               </w:rPr>
               <w:t xml:space="preserve">Queries and indexes; final recommendation</w:t>
@@ -2100,16 +2352,16 @@
           </w:tcPr>
           <w:p>
             <w:pPr>
-              <w:spacing w:after="0" w:before="0" w:line="360" w:lineRule="auto"/>
-              <w:rPr>
-                <w:sz w:val="20"/>
-                <w:szCs w:val="20"/>
+              <w:spacing w:after="0" w:before="0" w:line="240" w:lineRule="auto"/>
+              <w:rPr>
+                <w:sz w:val="18"/>
+                <w:szCs w:val="18"/>
               </w:rPr>
             </w:pPr>
             <w:r>
               <w:rPr>
-                <w:sz w:val="20"/>
-                <w:szCs w:val="20"/>
+                <w:sz w:val="18"/>
+                <w:szCs w:val="18"/>
                 <w:rtl w:val="0"/>
               </w:rPr>
               <w:t xml:space="preserve">Run the business queries and show the indexes in CouchDB</w:t>
@@ -2120,14 +2372,29 @@
     </w:tbl>
     <w:p>
       <w:pPr>
-        <w:spacing w:after="240" w:before="240" w:line="360" w:lineRule="auto"/>
-        <w:rPr/>
-      </w:pPr>
-      <w:r>
-        <w:rPr>
-          <w:rtl w:val="0"/>
-        </w:rPr>
-        <w:t xml:space="preserve">These responsibilities are subject to change. Every member will help with the whole project, understand all parts, and take part in the presentation and demo.</w:t>
+        <w:spacing w:after="240" w:before="240" w:line="276" w:lineRule="auto"/>
+        <w:rPr>
+          <w:sz w:val="20"/>
+          <w:szCs w:val="20"/>
+        </w:rPr>
+      </w:pPr>
+      <w:r>
+        <w:rPr>
+          <w:b w:val="1"/>
+          <w:bCs w:val="1"/>
+          <w:sz w:val="20"/>
+          <w:szCs w:val="20"/>
+          <w:rtl w:val="0"/>
+        </w:rPr>
+        <w:t xml:space="preserve">These responsibilities are subject to change. </w:t>
+      </w:r>
+      <w:r>
+        <w:rPr>
+          <w:sz w:val="20"/>
+          <w:szCs w:val="20"/>
+          <w:rtl w:val="0"/>
+        </w:rPr>
+        <w:t xml:space="preserve">Every member will help with the whole project, understand all parts, and take part in the presentation and demo.</w:t>
       </w:r>
       <w:r>
         <w:rPr>
@@ -2141,17 +2408,21 @@
           <w:ilvl w:val="0"/>
           <w:numId w:val="3"/>
         </w:numPr>
-        <w:spacing w:after="200" w:before="200" w:line="360" w:lineRule="auto"/>
+        <w:spacing w:after="200" w:before="200" w:line="276" w:lineRule="auto"/>
         <w:ind w:left="720" w:hanging="360"/>
         <w:rPr>
           <w:b w:val="1"/>
           <w:bCs w:val="1"/>
-        </w:rPr>
-      </w:pPr>
-      <w:r>
-        <w:rPr>
-          <w:b w:val="1"/>
-          <w:bCs w:val="1"/>
+          <w:sz w:val="20"/>
+          <w:szCs w:val="20"/>
+        </w:rPr>
+      </w:pPr>
+      <w:r>
+        <w:rPr>
+          <w:b w:val="1"/>
+          <w:bCs w:val="1"/>
+          <w:sz w:val="20"/>
+          <w:szCs w:val="20"/>
           <w:rtl w:val="0"/>
         </w:rPr>
         <w:t xml:space="preserve">At least two technical risks, setup questions, or issues the group expects to investigate.</w:t>
@@ -2159,17 +2430,21 @@
     </w:p>
     <w:p>
       <w:pPr>
-        <w:spacing w:after="240" w:before="240" w:line="360" w:lineRule="auto"/>
+        <w:spacing w:after="240" w:before="240" w:line="276" w:lineRule="auto"/>
         <w:ind w:left="720" w:firstLine="0"/>
         <w:rPr>
           <w:b w:val="1"/>
           <w:bCs w:val="1"/>
-        </w:rPr>
-      </w:pPr>
-      <w:r>
-        <w:rPr>
-          <w:b w:val="1"/>
-          <w:bCs w:val="1"/>
+          <w:sz w:val="20"/>
+          <w:szCs w:val="20"/>
+        </w:rPr>
+      </w:pPr>
+      <w:r>
+        <w:rPr>
+          <w:b w:val="1"/>
+          <w:bCs w:val="1"/>
+          <w:sz w:val="20"/>
+          <w:szCs w:val="20"/>
           <w:rtl w:val="0"/>
         </w:rPr>
         <w:t xml:space="preserve">Risks:</w:t>
@@ -2181,22 +2456,28 @@
           <w:ilvl w:val="1"/>
           <w:numId w:val="1"/>
         </w:numPr>
-        <w:spacing w:after="0" w:afterAutospacing="0" w:before="240" w:line="360" w:lineRule="auto"/>
+        <w:spacing w:after="0" w:afterAutospacing="0" w:before="240" w:line="276" w:lineRule="auto"/>
         <w:ind w:left="1440" w:hanging="360"/>
         <w:rPr>
           <w:rFonts w:ascii="Times New Roman" w:cs="Times New Roman" w:eastAsia="Times New Roman" w:hAnsi="Times New Roman"/>
-        </w:rPr>
-      </w:pPr>
-      <w:r>
-        <w:rPr>
-          <w:b w:val="1"/>
-          <w:bCs w:val="1"/>
+          <w:sz w:val="20"/>
+          <w:szCs w:val="20"/>
+        </w:rPr>
+      </w:pPr>
+      <w:r>
+        <w:rPr>
+          <w:b w:val="1"/>
+          <w:bCs w:val="1"/>
+          <w:sz w:val="20"/>
+          <w:szCs w:val="20"/>
           <w:rtl w:val="0"/>
         </w:rPr>
         <w:t xml:space="preserve">Installation problems:</w:t>
       </w:r>
       <w:r>
         <w:rPr>
+          <w:sz w:val="20"/>
+          <w:szCs w:val="20"/>
           <w:rtl w:val="0"/>
         </w:rPr>
         <w:t xml:space="preserve"> Members use different computers, so CouchDB and MySQL setup may not behave the same for everyone.</w:t>
@@ -2208,22 +2489,28 @@
           <w:ilvl w:val="1"/>
           <w:numId w:val="1"/>
         </w:numPr>
-        <w:spacing w:after="0" w:afterAutospacing="0" w:before="0" w:beforeAutospacing="0" w:line="360" w:lineRule="auto"/>
+        <w:spacing w:after="0" w:afterAutospacing="0" w:before="0" w:beforeAutospacing="0" w:line="276" w:lineRule="auto"/>
         <w:ind w:left="1440" w:hanging="360"/>
         <w:rPr>
           <w:rFonts w:ascii="Times New Roman" w:cs="Times New Roman" w:eastAsia="Times New Roman" w:hAnsi="Times New Roman"/>
-        </w:rPr>
-      </w:pPr>
-      <w:r>
-        <w:rPr>
-          <w:b w:val="1"/>
-          <w:bCs w:val="1"/>
+          <w:sz w:val="20"/>
+          <w:szCs w:val="20"/>
+        </w:rPr>
+      </w:pPr>
+      <w:r>
+        <w:rPr>
+          <w:b w:val="1"/>
+          <w:bCs w:val="1"/>
+          <w:sz w:val="20"/>
+          <w:szCs w:val="20"/>
           <w:rtl w:val="0"/>
         </w:rPr>
         <w:t xml:space="preserve">Import errors:</w:t>
       </w:r>
       <w:r>
         <w:rPr>
+          <w:sz w:val="20"/>
+          <w:szCs w:val="20"/>
           <w:rtl w:val="0"/>
         </w:rPr>
         <w:t xml:space="preserve"> Importing twice or into the wrong database could create duplicate or conflicting data. Mitigation: import once and verify the counts.</w:t>
@@ -2235,22 +2522,28 @@
           <w:ilvl w:val="1"/>
           <w:numId w:val="1"/>
         </w:numPr>
-        <w:spacing w:after="240" w:before="0" w:beforeAutospacing="0" w:line="360" w:lineRule="auto"/>
+        <w:spacing w:after="240" w:before="0" w:beforeAutospacing="0" w:line="276" w:lineRule="auto"/>
         <w:ind w:left="1440" w:hanging="360"/>
         <w:rPr>
           <w:rFonts w:ascii="Times New Roman" w:cs="Times New Roman" w:eastAsia="Times New Roman" w:hAnsi="Times New Roman"/>
-        </w:rPr>
-      </w:pPr>
-      <w:r>
-        <w:rPr>
-          <w:b w:val="1"/>
-          <w:bCs w:val="1"/>
+          <w:sz w:val="20"/>
+          <w:szCs w:val="20"/>
+        </w:rPr>
+      </w:pPr>
+      <w:r>
+        <w:rPr>
+          <w:b w:val="1"/>
+          <w:bCs w:val="1"/>
+          <w:sz w:val="20"/>
+          <w:szCs w:val="20"/>
           <w:rtl w:val="0"/>
         </w:rPr>
         <w:t xml:space="preserve">Learning CouchDB queries:</w:t>
       </w:r>
       <w:r>
         <w:rPr>
+          <w:sz w:val="20"/>
+          <w:szCs w:val="20"/>
           <w:rtl w:val="0"/>
         </w:rPr>
         <w:t xml:space="preserve"> Mango selectors and indexes are new to the group and may take extra time.</w:t>
@@ -2258,17 +2551,21 @@
     </w:p>
     <w:p>
       <w:pPr>
-        <w:spacing w:after="240" w:before="240" w:line="360" w:lineRule="auto"/>
+        <w:spacing w:after="240" w:before="240" w:line="276" w:lineRule="auto"/>
         <w:ind w:left="720" w:firstLine="0"/>
         <w:rPr>
           <w:b w:val="1"/>
           <w:bCs w:val="1"/>
-        </w:rPr>
-      </w:pPr>
-      <w:r>
-        <w:rPr>
-          <w:b w:val="1"/>
-          <w:bCs w:val="1"/>
+          <w:sz w:val="20"/>
+          <w:szCs w:val="20"/>
+        </w:rPr>
+      </w:pPr>
+      <w:r>
+        <w:rPr>
+          <w:b w:val="1"/>
+          <w:bCs w:val="1"/>
+          <w:sz w:val="20"/>
+          <w:szCs w:val="20"/>
           <w:rtl w:val="0"/>
         </w:rPr>
         <w:t xml:space="preserve">Questions for the instructor:</w:t>
@@ -2280,12 +2577,17 @@
           <w:ilvl w:val="1"/>
           <w:numId w:val="1"/>
         </w:numPr>
-        <w:spacing w:after="0" w:afterAutospacing="0" w:before="240" w:line="360" w:lineRule="auto"/>
+        <w:spacing w:after="0" w:afterAutospacing="0" w:before="240" w:line="276" w:lineRule="auto"/>
         <w:ind w:left="1440" w:hanging="360"/>
-        <w:rPr/>
-      </w:pPr>
-      <w:r>
-        <w:rPr>
+        <w:rPr>
+          <w:sz w:val="20"/>
+          <w:szCs w:val="20"/>
+        </w:rPr>
+      </w:pPr>
+      <w:r>
+        <w:rPr>
+          <w:sz w:val="20"/>
+          <w:szCs w:val="20"/>
           <w:rtl w:val="0"/>
         </w:rPr>
         <w:t xml:space="preserve">Should the MySQL design be fully normalized (e.g., add a </w:t>
@@ -2295,6 +2597,8 @@
           <w:i w:val="1"/>
           <w:iCs w:val="1"/>
           <w:color w:val="188038"/>
+          <w:sz w:val="20"/>
+          <w:szCs w:val="20"/>
           <w:rtl w:val="0"/>
         </w:rPr>
         <w:t xml:space="preserve">products</w:t>
@@ -2303,12 +2607,16 @@
         <w:rPr>
           <w:i w:val="1"/>
           <w:iCs w:val="1"/>
+          <w:sz w:val="20"/>
+          <w:szCs w:val="20"/>
           <w:rtl w:val="0"/>
         </w:rPr>
         <w:t xml:space="preserve"> </w:t>
       </w:r>
       <w:r>
         <w:rPr>
+          <w:sz w:val="20"/>
+          <w:szCs w:val="20"/>
           <w:rtl w:val="0"/>
         </w:rPr>
         <w:t xml:space="preserve">table), or is explaining that in the final report sufficient?</w:t>
@@ -2320,12 +2628,17 @@
           <w:ilvl w:val="1"/>
           <w:numId w:val="1"/>
         </w:numPr>
-        <w:spacing w:after="240" w:before="0" w:beforeAutospacing="0" w:line="360" w:lineRule="auto"/>
+        <w:spacing w:after="240" w:before="0" w:beforeAutospacing="0" w:line="276" w:lineRule="auto"/>
         <w:ind w:left="1440" w:hanging="360"/>
-        <w:rPr/>
-      </w:pPr>
-      <w:r>
-        <w:rPr>
+        <w:rPr>
+          <w:sz w:val="20"/>
+          <w:szCs w:val="20"/>
+        </w:rPr>
+      </w:pPr>
+      <w:r>
+        <w:rPr>
+          <w:sz w:val="20"/>
+          <w:szCs w:val="20"/>
           <w:rtl w:val="0"/>
         </w:rPr>
         <w:t xml:space="preserve">Is demonstrating document revisions acceptable as the CouchDB-specific feature, or would replication be preferred?</w:t>

</xml_diff>